<commit_message>
feat(generator): seed task generation and refresh report to the locked instance
</commit_message>
<xml_diff>
--- a/報告_VPP-RTS.docx
+++ b/報告_VPP-RTS.docx
@@ -1393,7 +1393,7 @@
         <w:rPr>
           <w:rFonts w:ascii="Microsoft JhengHei" w:hAnsi="Microsoft JhengHei" w:eastAsia="Microsoft JhengHei"/>
         </w:rPr>
-        <w:t>4.1 本次產生的週期任務集（9 個任務，frame size = 4）</w:t>
+        <w:t>4.1 本次產生的週期任務集（8 個任務，frame size = 4）</w:t>
       </w:r>
     </w:p>
     <w:tbl>
@@ -1586,7 +1586,7 @@
                 <w:rFonts w:ascii="Microsoft JhengHei" w:hAnsi="Microsoft JhengHei" w:eastAsia="Microsoft JhengHei"/>
                 <w:sz w:val="18"/>
               </w:rPr>
-              <w:t>23</w:t>
+              <w:t>20</w:t>
             </w:r>
           </w:p>
         </w:tc>
@@ -1601,7 +1601,7 @@
                 <w:rFonts w:ascii="Microsoft JhengHei" w:hAnsi="Microsoft JhengHei" w:eastAsia="Microsoft JhengHei"/>
                 <w:sz w:val="18"/>
               </w:rPr>
-              <w:t>24</w:t>
+              <w:t>20</w:t>
             </w:r>
           </w:p>
         </w:tc>
@@ -1646,7 +1646,7 @@
                 <w:rFonts w:ascii="Microsoft JhengHei" w:hAnsi="Microsoft JhengHei" w:eastAsia="Microsoft JhengHei"/>
                 <w:sz w:val="18"/>
               </w:rPr>
-              <w:t>17</w:t>
+              <w:t>11</w:t>
             </w:r>
           </w:p>
         </w:tc>
@@ -1661,7 +1661,7 @@
                 <w:rFonts w:ascii="Microsoft JhengHei" w:hAnsi="Microsoft JhengHei" w:eastAsia="Microsoft JhengHei"/>
                 <w:sz w:val="18"/>
               </w:rPr>
-              <w:t>是</w:t>
+              <w:t>否</w:t>
             </w:r>
           </w:p>
         </w:tc>
@@ -1676,7 +1676,7 @@
                 <w:rFonts w:ascii="Microsoft JhengHei" w:hAnsi="Microsoft JhengHei" w:eastAsia="Microsoft JhengHei"/>
                 <w:sz w:val="18"/>
               </w:rPr>
-              <w:t>2</w:t>
+              <w:t>3</w:t>
             </w:r>
           </w:p>
         </w:tc>
@@ -1708,7 +1708,7 @@
                 <w:rFonts w:ascii="Microsoft JhengHei" w:hAnsi="Microsoft JhengHei" w:eastAsia="Microsoft JhengHei"/>
                 <w:sz w:val="18"/>
               </w:rPr>
-              <w:t>14</w:t>
+              <w:t>1</w:t>
             </w:r>
           </w:p>
         </w:tc>
@@ -1723,7 +1723,7 @@
                 <w:rFonts w:ascii="Microsoft JhengHei" w:hAnsi="Microsoft JhengHei" w:eastAsia="Microsoft JhengHei"/>
                 <w:sz w:val="18"/>
               </w:rPr>
-              <w:t>15</w:t>
+              <w:t>10</w:t>
             </w:r>
           </w:p>
         </w:tc>
@@ -1753,7 +1753,7 @@
                 <w:rFonts w:ascii="Microsoft JhengHei" w:hAnsi="Microsoft JhengHei" w:eastAsia="Microsoft JhengHei"/>
                 <w:sz w:val="18"/>
               </w:rPr>
-              <w:t>10</w:t>
+              <w:t>8</w:t>
             </w:r>
           </w:p>
         </w:tc>
@@ -1768,7 +1768,7 @@
                 <w:rFonts w:ascii="Microsoft JhengHei" w:hAnsi="Microsoft JhengHei" w:eastAsia="Microsoft JhengHei"/>
                 <w:sz w:val="18"/>
               </w:rPr>
-              <w:t>18</w:t>
+              <w:t>17</w:t>
             </w:r>
           </w:p>
         </w:tc>
@@ -1798,7 +1798,7 @@
                 <w:rFonts w:ascii="Microsoft JhengHei" w:hAnsi="Microsoft JhengHei" w:eastAsia="Microsoft JhengHei"/>
                 <w:sz w:val="18"/>
               </w:rPr>
-              <w:t>4</w:t>
+              <w:t>7</w:t>
             </w:r>
           </w:p>
         </w:tc>
@@ -1830,7 +1830,7 @@
                 <w:rFonts w:ascii="Microsoft JhengHei" w:hAnsi="Microsoft JhengHei" w:eastAsia="Microsoft JhengHei"/>
                 <w:sz w:val="18"/>
               </w:rPr>
-              <w:t>3</w:t>
+              <w:t>17</w:t>
             </w:r>
           </w:p>
         </w:tc>
@@ -1860,7 +1860,7 @@
                 <w:rFonts w:ascii="Microsoft JhengHei" w:hAnsi="Microsoft JhengHei" w:eastAsia="Microsoft JhengHei"/>
                 <w:sz w:val="18"/>
               </w:rPr>
-              <w:t>1</w:t>
+              <w:t>4</w:t>
             </w:r>
           </w:p>
         </w:tc>
@@ -1875,7 +1875,7 @@
                 <w:rFonts w:ascii="Microsoft JhengHei" w:hAnsi="Microsoft JhengHei" w:eastAsia="Microsoft JhengHei"/>
                 <w:sz w:val="18"/>
               </w:rPr>
-              <w:t>18</w:t>
+              <w:t>4</w:t>
             </w:r>
           </w:p>
         </w:tc>
@@ -1890,7 +1890,7 @@
                 <w:rFonts w:ascii="Microsoft JhengHei" w:hAnsi="Microsoft JhengHei" w:eastAsia="Microsoft JhengHei"/>
                 <w:sz w:val="18"/>
               </w:rPr>
-              <w:t>18</w:t>
+              <w:t>8</w:t>
             </w:r>
           </w:p>
         </w:tc>
@@ -1952,495 +1952,7 @@
                 <w:rFonts w:ascii="Microsoft JhengHei" w:hAnsi="Microsoft JhengHei" w:eastAsia="Microsoft JhengHei"/>
                 <w:sz w:val="18"/>
               </w:rPr>
-              <w:t>19</w:t>
-            </w:r>
-          </w:p>
-        </w:tc>
-        <w:tc>
-          <w:tcPr>
-            <w:tcW w:type="dxa" w:w="1080"/>
-          </w:tcPr>
-          <w:p>
-            <w:r/>
-            <w:r>
-              <w:rPr>
-                <w:rFonts w:ascii="Microsoft JhengHei" w:hAnsi="Microsoft JhengHei" w:eastAsia="Microsoft JhengHei"/>
-                <w:sz w:val="18"/>
-              </w:rPr>
-              <w:t>20</w:t>
-            </w:r>
-          </w:p>
-        </w:tc>
-        <w:tc>
-          <w:tcPr>
-            <w:tcW w:type="dxa" w:w="1080"/>
-          </w:tcPr>
-          <w:p>
-            <w:r/>
-            <w:r>
-              <w:rPr>
-                <w:rFonts w:ascii="Microsoft JhengHei" w:hAnsi="Microsoft JhengHei" w:eastAsia="Microsoft JhengHei"/>
-                <w:sz w:val="18"/>
-              </w:rPr>
-              <w:t>4</w:t>
-            </w:r>
-          </w:p>
-        </w:tc>
-        <w:tc>
-          <w:tcPr>
-            <w:tcW w:type="dxa" w:w="1080"/>
-          </w:tcPr>
-          <w:p>
-            <w:r/>
-            <w:r>
-              <w:rPr>
-                <w:rFonts w:ascii="Microsoft JhengHei" w:hAnsi="Microsoft JhengHei" w:eastAsia="Microsoft JhengHei"/>
-                <w:sz w:val="18"/>
-              </w:rPr>
-              <w:t>4</w:t>
-            </w:r>
-          </w:p>
-        </w:tc>
-        <w:tc>
-          <w:tcPr>
-            <w:tcW w:type="dxa" w:w="1080"/>
-          </w:tcPr>
-          <w:p>
-            <w:r/>
-            <w:r>
-              <w:rPr>
-                <w:rFonts w:ascii="Microsoft JhengHei" w:hAnsi="Microsoft JhengHei" w:eastAsia="Microsoft JhengHei"/>
-                <w:sz w:val="18"/>
-              </w:rPr>
-              <w:t>14</w:t>
-            </w:r>
-          </w:p>
-        </w:tc>
-        <w:tc>
-          <w:tcPr>
-            <w:tcW w:type="dxa" w:w="1080"/>
-          </w:tcPr>
-          <w:p>
-            <w:r/>
-            <w:r>
-              <w:rPr>
-                <w:rFonts w:ascii="Microsoft JhengHei" w:hAnsi="Microsoft JhengHei" w:eastAsia="Microsoft JhengHei"/>
-                <w:sz w:val="18"/>
-              </w:rPr>
-              <w:t>否</w:t>
-            </w:r>
-          </w:p>
-        </w:tc>
-        <w:tc>
-          <w:tcPr>
-            <w:tcW w:type="dxa" w:w="1080"/>
-          </w:tcPr>
-          <w:p>
-            <w:r/>
-            <w:r>
-              <w:rPr>
-                <w:rFonts w:ascii="Microsoft JhengHei" w:hAnsi="Microsoft JhengHei" w:eastAsia="Microsoft JhengHei"/>
-                <w:sz w:val="18"/>
-              </w:rPr>
-              <w:t>3</w:t>
-            </w:r>
-          </w:p>
-        </w:tc>
-      </w:tr>
-      <w:tr>
-        <w:tc>
-          <w:tcPr>
-            <w:tcW w:type="dxa" w:w="1080"/>
-          </w:tcPr>
-          <w:p>
-            <w:r/>
-            <w:r>
-              <w:rPr>
-                <w:rFonts w:ascii="Microsoft JhengHei" w:hAnsi="Microsoft JhengHei" w:eastAsia="Microsoft JhengHei"/>
-                <w:sz w:val="18"/>
-              </w:rPr>
-              <w:t>p5</w:t>
-            </w:r>
-          </w:p>
-        </w:tc>
-        <w:tc>
-          <w:tcPr>
-            <w:tcW w:type="dxa" w:w="1080"/>
-          </w:tcPr>
-          <w:p>
-            <w:r/>
-            <w:r>
-              <w:rPr>
-                <w:rFonts w:ascii="Microsoft JhengHei" w:hAnsi="Microsoft JhengHei" w:eastAsia="Microsoft JhengHei"/>
-                <w:sz w:val="18"/>
-              </w:rPr>
-              <w:t>9</w:t>
-            </w:r>
-          </w:p>
-        </w:tc>
-        <w:tc>
-          <w:tcPr>
-            <w:tcW w:type="dxa" w:w="1080"/>
-          </w:tcPr>
-          <w:p>
-            <w:r/>
-            <w:r>
-              <w:rPr>
-                <w:rFonts w:ascii="Microsoft JhengHei" w:hAnsi="Microsoft JhengHei" w:eastAsia="Microsoft JhengHei"/>
-                <w:sz w:val="18"/>
-              </w:rPr>
-              <w:t>16</w:t>
-            </w:r>
-          </w:p>
-        </w:tc>
-        <w:tc>
-          <w:tcPr>
-            <w:tcW w:type="dxa" w:w="1080"/>
-          </w:tcPr>
-          <w:p>
-            <w:r/>
-            <w:r>
-              <w:rPr>
-                <w:rFonts w:ascii="Microsoft JhengHei" w:hAnsi="Microsoft JhengHei" w:eastAsia="Microsoft JhengHei"/>
-                <w:sz w:val="18"/>
-              </w:rPr>
-              <w:t>2</w:t>
-            </w:r>
-          </w:p>
-        </w:tc>
-        <w:tc>
-          <w:tcPr>
-            <w:tcW w:type="dxa" w:w="1080"/>
-          </w:tcPr>
-          <w:p>
-            <w:r/>
-            <w:r>
-              <w:rPr>
-                <w:rFonts w:ascii="Microsoft JhengHei" w:hAnsi="Microsoft JhengHei" w:eastAsia="Microsoft JhengHei"/>
-                <w:sz w:val="18"/>
-              </w:rPr>
-              <w:t>12</w:t>
-            </w:r>
-          </w:p>
-        </w:tc>
-        <w:tc>
-          <w:tcPr>
-            <w:tcW w:type="dxa" w:w="1080"/>
-          </w:tcPr>
-          <w:p>
-            <w:r/>
-            <w:r>
-              <w:rPr>
-                <w:rFonts w:ascii="Microsoft JhengHei" w:hAnsi="Microsoft JhengHei" w:eastAsia="Microsoft JhengHei"/>
-                <w:sz w:val="18"/>
-              </w:rPr>
-              <w:t>14</w:t>
-            </w:r>
-          </w:p>
-        </w:tc>
-        <w:tc>
-          <w:tcPr>
-            <w:tcW w:type="dxa" w:w="1080"/>
-          </w:tcPr>
-          <w:p>
-            <w:r/>
-            <w:r>
-              <w:rPr>
-                <w:rFonts w:ascii="Microsoft JhengHei" w:hAnsi="Microsoft JhengHei" w:eastAsia="Microsoft JhengHei"/>
-                <w:sz w:val="18"/>
-              </w:rPr>
-              <w:t>否</w:t>
-            </w:r>
-          </w:p>
-        </w:tc>
-        <w:tc>
-          <w:tcPr>
-            <w:tcW w:type="dxa" w:w="1080"/>
-          </w:tcPr>
-          <w:p>
-            <w:r/>
-            <w:r>
-              <w:rPr>
-                <w:rFonts w:ascii="Microsoft JhengHei" w:hAnsi="Microsoft JhengHei" w:eastAsia="Microsoft JhengHei"/>
-                <w:sz w:val="18"/>
-              </w:rPr>
-              <w:t>4</w:t>
-            </w:r>
-          </w:p>
-        </w:tc>
-      </w:tr>
-      <w:tr>
-        <w:tc>
-          <w:tcPr>
-            <w:tcW w:type="dxa" w:w="1080"/>
-          </w:tcPr>
-          <w:p>
-            <w:r/>
-            <w:r>
-              <w:rPr>
-                <w:rFonts w:ascii="Microsoft JhengHei" w:hAnsi="Microsoft JhengHei" w:eastAsia="Microsoft JhengHei"/>
-                <w:sz w:val="18"/>
-              </w:rPr>
-              <w:t>p6</w:t>
-            </w:r>
-          </w:p>
-        </w:tc>
-        <w:tc>
-          <w:tcPr>
-            <w:tcW w:type="dxa" w:w="1080"/>
-          </w:tcPr>
-          <w:p>
-            <w:r/>
-            <w:r>
-              <w:rPr>
-                <w:rFonts w:ascii="Microsoft JhengHei" w:hAnsi="Microsoft JhengHei" w:eastAsia="Microsoft JhengHei"/>
-                <w:sz w:val="18"/>
-              </w:rPr>
-              <w:t>5</w:t>
-            </w:r>
-          </w:p>
-        </w:tc>
-        <w:tc>
-          <w:tcPr>
-            <w:tcW w:type="dxa" w:w="1080"/>
-          </w:tcPr>
-          <w:p>
-            <w:r/>
-            <w:r>
-              <w:rPr>
-                <w:rFonts w:ascii="Microsoft JhengHei" w:hAnsi="Microsoft JhengHei" w:eastAsia="Microsoft JhengHei"/>
-                <w:sz w:val="18"/>
-              </w:rPr>
-              <w:t>19</w:t>
-            </w:r>
-          </w:p>
-        </w:tc>
-        <w:tc>
-          <w:tcPr>
-            <w:tcW w:type="dxa" w:w="1080"/>
-          </w:tcPr>
-          <w:p>
-            <w:r/>
-            <w:r>
-              <w:rPr>
-                <w:rFonts w:ascii="Microsoft JhengHei" w:hAnsi="Microsoft JhengHei" w:eastAsia="Microsoft JhengHei"/>
-                <w:sz w:val="18"/>
-              </w:rPr>
-              <w:t>2</w:t>
-            </w:r>
-          </w:p>
-        </w:tc>
-        <w:tc>
-          <w:tcPr>
-            <w:tcW w:type="dxa" w:w="1080"/>
-          </w:tcPr>
-          <w:p>
-            <w:r/>
-            <w:r>
-              <w:rPr>
-                <w:rFonts w:ascii="Microsoft JhengHei" w:hAnsi="Microsoft JhengHei" w:eastAsia="Microsoft JhengHei"/>
-                <w:sz w:val="18"/>
-              </w:rPr>
-              <w:t>15</w:t>
-            </w:r>
-          </w:p>
-        </w:tc>
-        <w:tc>
-          <w:tcPr>
-            <w:tcW w:type="dxa" w:w="1080"/>
-          </w:tcPr>
-          <w:p>
-            <w:r/>
-            <w:r>
-              <w:rPr>
-                <w:rFonts w:ascii="Microsoft JhengHei" w:hAnsi="Microsoft JhengHei" w:eastAsia="Microsoft JhengHei"/>
-                <w:sz w:val="18"/>
-              </w:rPr>
-              <w:t>16</w:t>
-            </w:r>
-          </w:p>
-        </w:tc>
-        <w:tc>
-          <w:tcPr>
-            <w:tcW w:type="dxa" w:w="1080"/>
-          </w:tcPr>
-          <w:p>
-            <w:r/>
-            <w:r>
-              <w:rPr>
-                <w:rFonts w:ascii="Microsoft JhengHei" w:hAnsi="Microsoft JhengHei" w:eastAsia="Microsoft JhengHei"/>
-                <w:sz w:val="18"/>
-              </w:rPr>
-              <w:t>是</w:t>
-            </w:r>
-          </w:p>
-        </w:tc>
-        <w:tc>
-          <w:tcPr>
-            <w:tcW w:type="dxa" w:w="1080"/>
-          </w:tcPr>
-          <w:p>
-            <w:r/>
-            <w:r>
-              <w:rPr>
-                <w:rFonts w:ascii="Microsoft JhengHei" w:hAnsi="Microsoft JhengHei" w:eastAsia="Microsoft JhengHei"/>
-                <w:sz w:val="18"/>
-              </w:rPr>
-              <w:t>3</w:t>
-            </w:r>
-          </w:p>
-        </w:tc>
-      </w:tr>
-      <w:tr>
-        <w:tc>
-          <w:tcPr>
-            <w:tcW w:type="dxa" w:w="1080"/>
-          </w:tcPr>
-          <w:p>
-            <w:r/>
-            <w:r>
-              <w:rPr>
-                <w:rFonts w:ascii="Microsoft JhengHei" w:hAnsi="Microsoft JhengHei" w:eastAsia="Microsoft JhengHei"/>
-                <w:sz w:val="18"/>
-              </w:rPr>
-              <w:t>p7</w:t>
-            </w:r>
-          </w:p>
-        </w:tc>
-        <w:tc>
-          <w:tcPr>
-            <w:tcW w:type="dxa" w:w="1080"/>
-          </w:tcPr>
-          <w:p>
-            <w:r/>
-            <w:r>
-              <w:rPr>
-                <w:rFonts w:ascii="Microsoft JhengHei" w:hAnsi="Microsoft JhengHei" w:eastAsia="Microsoft JhengHei"/>
-                <w:sz w:val="18"/>
-              </w:rPr>
-              <w:t>14</w:t>
-            </w:r>
-          </w:p>
-        </w:tc>
-        <w:tc>
-          <w:tcPr>
-            <w:tcW w:type="dxa" w:w="1080"/>
-          </w:tcPr>
-          <w:p>
-            <w:r/>
-            <w:r>
-              <w:rPr>
-                <w:rFonts w:ascii="Microsoft JhengHei" w:hAnsi="Microsoft JhengHei" w:eastAsia="Microsoft JhengHei"/>
-                <w:sz w:val="18"/>
-              </w:rPr>
-              <w:t>17</w:t>
-            </w:r>
-          </w:p>
-        </w:tc>
-        <w:tc>
-          <w:tcPr>
-            <w:tcW w:type="dxa" w:w="1080"/>
-          </w:tcPr>
-          <w:p>
-            <w:r/>
-            <w:r>
-              <w:rPr>
-                <w:rFonts w:ascii="Microsoft JhengHei" w:hAnsi="Microsoft JhengHei" w:eastAsia="Microsoft JhengHei"/>
-                <w:sz w:val="18"/>
-              </w:rPr>
-              <w:t>3</w:t>
-            </w:r>
-          </w:p>
-        </w:tc>
-        <w:tc>
-          <w:tcPr>
-            <w:tcW w:type="dxa" w:w="1080"/>
-          </w:tcPr>
-          <w:p>
-            <w:r/>
-            <w:r>
-              <w:rPr>
-                <w:rFonts w:ascii="Microsoft JhengHei" w:hAnsi="Microsoft JhengHei" w:eastAsia="Microsoft JhengHei"/>
-                <w:sz w:val="18"/>
-              </w:rPr>
-              <w:t>11</w:t>
-            </w:r>
-          </w:p>
-        </w:tc>
-        <w:tc>
-          <w:tcPr>
-            <w:tcW w:type="dxa" w:w="1080"/>
-          </w:tcPr>
-          <w:p>
-            <w:r/>
-            <w:r>
-              <w:rPr>
-                <w:rFonts w:ascii="Microsoft JhengHei" w:hAnsi="Microsoft JhengHei" w:eastAsia="Microsoft JhengHei"/>
-                <w:sz w:val="18"/>
-              </w:rPr>
-              <w:t>6</w:t>
-            </w:r>
-          </w:p>
-        </w:tc>
-        <w:tc>
-          <w:tcPr>
-            <w:tcW w:type="dxa" w:w="1080"/>
-          </w:tcPr>
-          <w:p>
-            <w:r/>
-            <w:r>
-              <w:rPr>
-                <w:rFonts w:ascii="Microsoft JhengHei" w:hAnsi="Microsoft JhengHei" w:eastAsia="Microsoft JhengHei"/>
-                <w:sz w:val="18"/>
-              </w:rPr>
-              <w:t>是</w:t>
-            </w:r>
-          </w:p>
-        </w:tc>
-        <w:tc>
-          <w:tcPr>
-            <w:tcW w:type="dxa" w:w="1080"/>
-          </w:tcPr>
-          <w:p>
-            <w:r/>
-            <w:r>
-              <w:rPr>
-                <w:rFonts w:ascii="Microsoft JhengHei" w:hAnsi="Microsoft JhengHei" w:eastAsia="Microsoft JhengHei"/>
-                <w:sz w:val="18"/>
-              </w:rPr>
-              <w:t>3</w:t>
-            </w:r>
-          </w:p>
-        </w:tc>
-      </w:tr>
-      <w:tr>
-        <w:tc>
-          <w:tcPr>
-            <w:tcW w:type="dxa" w:w="1080"/>
-          </w:tcPr>
-          <w:p>
-            <w:r/>
-            <w:r>
-              <w:rPr>
-                <w:rFonts w:ascii="Microsoft JhengHei" w:hAnsi="Microsoft JhengHei" w:eastAsia="Microsoft JhengHei"/>
-                <w:sz w:val="18"/>
-              </w:rPr>
-              <w:t>p8</w:t>
-            </w:r>
-          </w:p>
-        </w:tc>
-        <w:tc>
-          <w:tcPr>
-            <w:tcW w:type="dxa" w:w="1080"/>
-          </w:tcPr>
-          <w:p>
-            <w:r/>
-            <w:r>
-              <w:rPr>
-                <w:rFonts w:ascii="Microsoft JhengHei" w:hAnsi="Microsoft JhengHei" w:eastAsia="Microsoft JhengHei"/>
-                <w:sz w:val="18"/>
-              </w:rPr>
-              <w:t>2</w:t>
+              <w:t>8</w:t>
             </w:r>
           </w:p>
         </w:tc>
@@ -2500,6 +2012,372 @@
                 <w:rFonts w:ascii="Microsoft JhengHei" w:hAnsi="Microsoft JhengHei" w:eastAsia="Microsoft JhengHei"/>
                 <w:sz w:val="18"/>
               </w:rPr>
+              <w:t>13</w:t>
+            </w:r>
+          </w:p>
+        </w:tc>
+        <w:tc>
+          <w:tcPr>
+            <w:tcW w:type="dxa" w:w="1080"/>
+          </w:tcPr>
+          <w:p>
+            <w:r/>
+            <w:r>
+              <w:rPr>
+                <w:rFonts w:ascii="Microsoft JhengHei" w:hAnsi="Microsoft JhengHei" w:eastAsia="Microsoft JhengHei"/>
+                <w:sz w:val="18"/>
+              </w:rPr>
+              <w:t>否</w:t>
+            </w:r>
+          </w:p>
+        </w:tc>
+        <w:tc>
+          <w:tcPr>
+            <w:tcW w:type="dxa" w:w="1080"/>
+          </w:tcPr>
+          <w:p>
+            <w:r/>
+            <w:r>
+              <w:rPr>
+                <w:rFonts w:ascii="Microsoft JhengHei" w:hAnsi="Microsoft JhengHei" w:eastAsia="Microsoft JhengHei"/>
+                <w:sz w:val="18"/>
+              </w:rPr>
+              <w:t>8</w:t>
+            </w:r>
+          </w:p>
+        </w:tc>
+      </w:tr>
+      <w:tr>
+        <w:tc>
+          <w:tcPr>
+            <w:tcW w:type="dxa" w:w="1080"/>
+          </w:tcPr>
+          <w:p>
+            <w:r/>
+            <w:r>
+              <w:rPr>
+                <w:rFonts w:ascii="Microsoft JhengHei" w:hAnsi="Microsoft JhengHei" w:eastAsia="Microsoft JhengHei"/>
+                <w:sz w:val="18"/>
+              </w:rPr>
+              <w:t>p5</w:t>
+            </w:r>
+          </w:p>
+        </w:tc>
+        <w:tc>
+          <w:tcPr>
+            <w:tcW w:type="dxa" w:w="1080"/>
+          </w:tcPr>
+          <w:p>
+            <w:r/>
+            <w:r>
+              <w:rPr>
+                <w:rFonts w:ascii="Microsoft JhengHei" w:hAnsi="Microsoft JhengHei" w:eastAsia="Microsoft JhengHei"/>
+                <w:sz w:val="18"/>
+              </w:rPr>
+              <w:t>8</w:t>
+            </w:r>
+          </w:p>
+        </w:tc>
+        <w:tc>
+          <w:tcPr>
+            <w:tcW w:type="dxa" w:w="1080"/>
+          </w:tcPr>
+          <w:p>
+            <w:r/>
+            <w:r>
+              <w:rPr>
+                <w:rFonts w:ascii="Microsoft JhengHei" w:hAnsi="Microsoft JhengHei" w:eastAsia="Microsoft JhengHei"/>
+                <w:sz w:val="18"/>
+              </w:rPr>
+              <w:t>24</w:t>
+            </w:r>
+          </w:p>
+        </w:tc>
+        <w:tc>
+          <w:tcPr>
+            <w:tcW w:type="dxa" w:w="1080"/>
+          </w:tcPr>
+          <w:p>
+            <w:r/>
+            <w:r>
+              <w:rPr>
+                <w:rFonts w:ascii="Microsoft JhengHei" w:hAnsi="Microsoft JhengHei" w:eastAsia="Microsoft JhengHei"/>
+                <w:sz w:val="18"/>
+              </w:rPr>
+              <w:t>2</w:t>
+            </w:r>
+          </w:p>
+        </w:tc>
+        <w:tc>
+          <w:tcPr>
+            <w:tcW w:type="dxa" w:w="1080"/>
+          </w:tcPr>
+          <w:p>
+            <w:r/>
+            <w:r>
+              <w:rPr>
+                <w:rFonts w:ascii="Microsoft JhengHei" w:hAnsi="Microsoft JhengHei" w:eastAsia="Microsoft JhengHei"/>
+                <w:sz w:val="18"/>
+              </w:rPr>
+              <w:t>19</w:t>
+            </w:r>
+          </w:p>
+        </w:tc>
+        <w:tc>
+          <w:tcPr>
+            <w:tcW w:type="dxa" w:w="1080"/>
+          </w:tcPr>
+          <w:p>
+            <w:r/>
+            <w:r>
+              <w:rPr>
+                <w:rFonts w:ascii="Microsoft JhengHei" w:hAnsi="Microsoft JhengHei" w:eastAsia="Microsoft JhengHei"/>
+                <w:sz w:val="18"/>
+              </w:rPr>
+              <w:t>17</w:t>
+            </w:r>
+          </w:p>
+        </w:tc>
+        <w:tc>
+          <w:tcPr>
+            <w:tcW w:type="dxa" w:w="1080"/>
+          </w:tcPr>
+          <w:p>
+            <w:r/>
+            <w:r>
+              <w:rPr>
+                <w:rFonts w:ascii="Microsoft JhengHei" w:hAnsi="Microsoft JhengHei" w:eastAsia="Microsoft JhengHei"/>
+                <w:sz w:val="18"/>
+              </w:rPr>
+              <w:t>否</w:t>
+            </w:r>
+          </w:p>
+        </w:tc>
+        <w:tc>
+          <w:tcPr>
+            <w:tcW w:type="dxa" w:w="1080"/>
+          </w:tcPr>
+          <w:p>
+            <w:r/>
+            <w:r>
+              <w:rPr>
+                <w:rFonts w:ascii="Microsoft JhengHei" w:hAnsi="Microsoft JhengHei" w:eastAsia="Microsoft JhengHei"/>
+                <w:sz w:val="18"/>
+              </w:rPr>
+              <w:t>2</w:t>
+            </w:r>
+          </w:p>
+        </w:tc>
+      </w:tr>
+      <w:tr>
+        <w:tc>
+          <w:tcPr>
+            <w:tcW w:type="dxa" w:w="1080"/>
+          </w:tcPr>
+          <w:p>
+            <w:r/>
+            <w:r>
+              <w:rPr>
+                <w:rFonts w:ascii="Microsoft JhengHei" w:hAnsi="Microsoft JhengHei" w:eastAsia="Microsoft JhengHei"/>
+                <w:sz w:val="18"/>
+              </w:rPr>
+              <w:t>p6</w:t>
+            </w:r>
+          </w:p>
+        </w:tc>
+        <w:tc>
+          <w:tcPr>
+            <w:tcW w:type="dxa" w:w="1080"/>
+          </w:tcPr>
+          <w:p>
+            <w:r/>
+            <w:r>
+              <w:rPr>
+                <w:rFonts w:ascii="Microsoft JhengHei" w:hAnsi="Microsoft JhengHei" w:eastAsia="Microsoft JhengHei"/>
+                <w:sz w:val="18"/>
+              </w:rPr>
+              <w:t>11</w:t>
+            </w:r>
+          </w:p>
+        </w:tc>
+        <w:tc>
+          <w:tcPr>
+            <w:tcW w:type="dxa" w:w="1080"/>
+          </w:tcPr>
+          <w:p>
+            <w:r/>
+            <w:r>
+              <w:rPr>
+                <w:rFonts w:ascii="Microsoft JhengHei" w:hAnsi="Microsoft JhengHei" w:eastAsia="Microsoft JhengHei"/>
+                <w:sz w:val="18"/>
+              </w:rPr>
+              <w:t>13</w:t>
+            </w:r>
+          </w:p>
+        </w:tc>
+        <w:tc>
+          <w:tcPr>
+            <w:tcW w:type="dxa" w:w="1080"/>
+          </w:tcPr>
+          <w:p>
+            <w:r/>
+            <w:r>
+              <w:rPr>
+                <w:rFonts w:ascii="Microsoft JhengHei" w:hAnsi="Microsoft JhengHei" w:eastAsia="Microsoft JhengHei"/>
+                <w:sz w:val="18"/>
+              </w:rPr>
+              <w:t>2</w:t>
+            </w:r>
+          </w:p>
+        </w:tc>
+        <w:tc>
+          <w:tcPr>
+            <w:tcW w:type="dxa" w:w="1080"/>
+          </w:tcPr>
+          <w:p>
+            <w:r/>
+            <w:r>
+              <w:rPr>
+                <w:rFonts w:ascii="Microsoft JhengHei" w:hAnsi="Microsoft JhengHei" w:eastAsia="Microsoft JhengHei"/>
+                <w:sz w:val="18"/>
+              </w:rPr>
+              <w:t>11</w:t>
+            </w:r>
+          </w:p>
+        </w:tc>
+        <w:tc>
+          <w:tcPr>
+            <w:tcW w:type="dxa" w:w="1080"/>
+          </w:tcPr>
+          <w:p>
+            <w:r/>
+            <w:r>
+              <w:rPr>
+                <w:rFonts w:ascii="Microsoft JhengHei" w:hAnsi="Microsoft JhengHei" w:eastAsia="Microsoft JhengHei"/>
+                <w:sz w:val="18"/>
+              </w:rPr>
+              <w:t>17</w:t>
+            </w:r>
+          </w:p>
+        </w:tc>
+        <w:tc>
+          <w:tcPr>
+            <w:tcW w:type="dxa" w:w="1080"/>
+          </w:tcPr>
+          <w:p>
+            <w:r/>
+            <w:r>
+              <w:rPr>
+                <w:rFonts w:ascii="Microsoft JhengHei" w:hAnsi="Microsoft JhengHei" w:eastAsia="Microsoft JhengHei"/>
+                <w:sz w:val="18"/>
+              </w:rPr>
+              <w:t>否</w:t>
+            </w:r>
+          </w:p>
+        </w:tc>
+        <w:tc>
+          <w:tcPr>
+            <w:tcW w:type="dxa" w:w="1080"/>
+          </w:tcPr>
+          <w:p>
+            <w:r/>
+            <w:r>
+              <w:rPr>
+                <w:rFonts w:ascii="Microsoft JhengHei" w:hAnsi="Microsoft JhengHei" w:eastAsia="Microsoft JhengHei"/>
+                <w:sz w:val="18"/>
+              </w:rPr>
+              <w:t>4</w:t>
+            </w:r>
+          </w:p>
+        </w:tc>
+      </w:tr>
+      <w:tr>
+        <w:tc>
+          <w:tcPr>
+            <w:tcW w:type="dxa" w:w="1080"/>
+          </w:tcPr>
+          <w:p>
+            <w:r/>
+            <w:r>
+              <w:rPr>
+                <w:rFonts w:ascii="Microsoft JhengHei" w:hAnsi="Microsoft JhengHei" w:eastAsia="Microsoft JhengHei"/>
+                <w:sz w:val="18"/>
+              </w:rPr>
+              <w:t>p7</w:t>
+            </w:r>
+          </w:p>
+        </w:tc>
+        <w:tc>
+          <w:tcPr>
+            <w:tcW w:type="dxa" w:w="1080"/>
+          </w:tcPr>
+          <w:p>
+            <w:r/>
+            <w:r>
+              <w:rPr>
+                <w:rFonts w:ascii="Microsoft JhengHei" w:hAnsi="Microsoft JhengHei" w:eastAsia="Microsoft JhengHei"/>
+                <w:sz w:val="18"/>
+              </w:rPr>
+              <w:t>10</w:t>
+            </w:r>
+          </w:p>
+        </w:tc>
+        <w:tc>
+          <w:tcPr>
+            <w:tcW w:type="dxa" w:w="1080"/>
+          </w:tcPr>
+          <w:p>
+            <w:r/>
+            <w:r>
+              <w:rPr>
+                <w:rFonts w:ascii="Microsoft JhengHei" w:hAnsi="Microsoft JhengHei" w:eastAsia="Microsoft JhengHei"/>
+                <w:sz w:val="18"/>
+              </w:rPr>
+              <w:t>16</w:t>
+            </w:r>
+          </w:p>
+        </w:tc>
+        <w:tc>
+          <w:tcPr>
+            <w:tcW w:type="dxa" w:w="1080"/>
+          </w:tcPr>
+          <w:p>
+            <w:r/>
+            <w:r>
+              <w:rPr>
+                <w:rFonts w:ascii="Microsoft JhengHei" w:hAnsi="Microsoft JhengHei" w:eastAsia="Microsoft JhengHei"/>
+                <w:sz w:val="18"/>
+              </w:rPr>
+              <w:t>2</w:t>
+            </w:r>
+          </w:p>
+        </w:tc>
+        <w:tc>
+          <w:tcPr>
+            <w:tcW w:type="dxa" w:w="1080"/>
+          </w:tcPr>
+          <w:p>
+            <w:r/>
+            <w:r>
+              <w:rPr>
+                <w:rFonts w:ascii="Microsoft JhengHei" w:hAnsi="Microsoft JhengHei" w:eastAsia="Microsoft JhengHei"/>
+                <w:sz w:val="18"/>
+              </w:rPr>
+              <w:t>13</w:t>
+            </w:r>
+          </w:p>
+        </w:tc>
+        <w:tc>
+          <w:tcPr>
+            <w:tcW w:type="dxa" w:w="1080"/>
+          </w:tcPr>
+          <w:p>
+            <w:r/>
+            <w:r>
+              <w:rPr>
+                <w:rFonts w:ascii="Microsoft JhengHei" w:hAnsi="Microsoft JhengHei" w:eastAsia="Microsoft JhengHei"/>
+                <w:sz w:val="18"/>
+              </w:rPr>
               <w:t>16</w:t>
             </w:r>
           </w:p>
@@ -2530,7 +2408,7 @@
                 <w:rFonts w:ascii="Microsoft JhengHei" w:hAnsi="Microsoft JhengHei" w:eastAsia="Microsoft JhengHei"/>
                 <w:sz w:val="18"/>
               </w:rPr>
-              <w:t>9</w:t>
+              <w:t>4</w:t>
             </w:r>
           </w:p>
         </w:tc>
@@ -2547,7 +2425,7 @@
                 <w:rFonts w:ascii="Microsoft JhengHei" w:hAnsi="Microsoft JhengHei" w:eastAsia="Microsoft JhengHei"/>
                 <w:sz w:val="18"/>
               </w:rPr>
-              <w:t>p9</w:t>
+              <w:t>p8</w:t>
             </w:r>
           </w:p>
         </w:tc>
@@ -2562,7 +2440,7 @@
                 <w:rFonts w:ascii="Microsoft JhengHei" w:hAnsi="Microsoft JhengHei" w:eastAsia="Microsoft JhengHei"/>
                 <w:sz w:val="18"/>
               </w:rPr>
-              <w:t>4</w:t>
+              <w:t>9</w:t>
             </w:r>
           </w:p>
         </w:tc>
@@ -2577,7 +2455,7 @@
                 <w:rFonts w:ascii="Microsoft JhengHei" w:hAnsi="Microsoft JhengHei" w:eastAsia="Microsoft JhengHei"/>
                 <w:sz w:val="18"/>
               </w:rPr>
-              <w:t>21</w:t>
+              <w:t>9</w:t>
             </w:r>
           </w:p>
         </w:tc>
@@ -2592,7 +2470,7 @@
                 <w:rFonts w:ascii="Microsoft JhengHei" w:hAnsi="Microsoft JhengHei" w:eastAsia="Microsoft JhengHei"/>
                 <w:sz w:val="18"/>
               </w:rPr>
-              <w:t>3</w:t>
+              <w:t>2</w:t>
             </w:r>
           </w:p>
         </w:tc>
@@ -2607,7 +2485,7 @@
                 <w:rFonts w:ascii="Microsoft JhengHei" w:hAnsi="Microsoft JhengHei" w:eastAsia="Microsoft JhengHei"/>
                 <w:sz w:val="18"/>
               </w:rPr>
-              <w:t>19</w:t>
+              <w:t>7</w:t>
             </w:r>
           </w:p>
         </w:tc>
@@ -2622,7 +2500,7 @@
                 <w:rFonts w:ascii="Microsoft JhengHei" w:hAnsi="Microsoft JhengHei" w:eastAsia="Microsoft JhengHei"/>
                 <w:sz w:val="18"/>
               </w:rPr>
-              <w:t>15</w:t>
+              <w:t>13</w:t>
             </w:r>
           </w:p>
         </w:tc>
@@ -2637,7 +2515,7 @@
                 <w:rFonts w:ascii="Microsoft JhengHei" w:hAnsi="Microsoft JhengHei" w:eastAsia="Microsoft JhengHei"/>
                 <w:sz w:val="18"/>
               </w:rPr>
-              <w:t>是</w:t>
+              <w:t>否</w:t>
             </w:r>
           </w:p>
         </w:tc>
@@ -2652,7 +2530,7 @@
                 <w:rFonts w:ascii="Microsoft JhengHei" w:hAnsi="Microsoft JhengHei" w:eastAsia="Microsoft JhengHei"/>
                 <w:sz w:val="18"/>
               </w:rPr>
-              <w:t>3</w:t>
+              <w:t>7</w:t>
             </w:r>
           </w:p>
         </w:tc>
@@ -2673,7 +2551,7 @@
           <w:b/>
           <w:sz w:val="21"/>
         </w:rPr>
-        <w:t>34 個週期 job</w:t>
+        <w:t>38 個週期 job</w:t>
       </w:r>
       <w:r>
         <w:rPr>
@@ -2689,7 +2567,7 @@
           <w:b/>
           <w:sz w:val="21"/>
         </w:rPr>
-        <w:t>1.22 ≥ 0.7 ✔</w:t>
+        <w:t>1.31 ≥ 0.7 ✔</w:t>
       </w:r>
       <w:r>
         <w:rPr>
@@ -2697,7 +2575,7 @@
           <w:b w:val="0"/>
           <w:sz w:val="21"/>
         </w:rPr>
-        <w:t>；週期種類 8 種（≥3 ✔）；d=e 的有 p1、p4（2/9 ≈ 22% ≥ 20% ✔）；非搶占且 e≠1 的有 p2、p4、p5（≥2 ✔）。frame size f=4 通過三條件 ✔。</w:t>
+        <w:t>；週期種類 7 種（≥3 ✔）；d=e 的有 p1、p3（2/8 = 25% ≥ 20% ✔）；非搶占且 e≠1 的有 p2、p5、p6、p7、p8（≥2 ✔）；frame size f=4 通過三條件（p8 最緊：2f−gcd(4,9)=7≤7 ✔）。本次實例所有任務皆為非搶占。</w:t>
       </w:r>
     </w:p>
     <w:p>
@@ -4866,7 +4744,7 @@
           <w:rFonts w:ascii="Microsoft JhengHei" w:hAnsi="Microsoft JhengHei" w:eastAsia="Microsoft JhengHei"/>
           <w:sz w:val="21"/>
         </w:rPr>
-        <w:t>R10：有序對 (a,b)，在 b 的視窗內 e_a·x[b][t] ≤ Σ_{s&lt;t} x[a][s]，即 a 全部做完前 b 不得啟動；重用 x，無新變數。未設定時程式自動挑一組可行的非平凡對（本次為 p8_0 → p3_0）。</w:t>
+        <w:t>R10：有序對 (a,b)，在 b 的視窗內 e_a·x[b][t] ≤ Σ_{s&lt;t} x[a][s]，即 a 全部做完前 b 不得啟動；重用 x，無新變數。未設定時程式自動挑一組可行的非平凡對（本次為 p2_0 → p4_0）。</w:t>
       </w:r>
     </w:p>
     <w:p>
@@ -5112,7 +4990,7 @@
         <w:rPr>
           <w:rFonts w:ascii="Microsoft JhengHei" w:hAnsi="Microsoft JhengHei" w:eastAsia="Microsoft JhengHei"/>
         </w:rPr>
-        <w:t>10.1 動態排程的 9 輪再最佳化（共 9 次 MILP 解，約 15 秒）</w:t>
+        <w:t>10.1 動態排程的 9 輪再最佳化（共 9 次 MILP 解，約 12 秒，單執行緒、可重現）</w:t>
       </w:r>
     </w:p>
     <w:tbl>
@@ -5631,7 +5509,7 @@
                 <w:rFonts w:ascii="Microsoft JhengHei" w:hAnsi="Microsoft JhengHei" w:eastAsia="Microsoft JhengHei"/>
                 <w:sz w:val="18"/>
               </w:rPr>
-              <w:t>接受（保留下限 7.0）</w:t>
+              <w:t>接受</w:t>
             </w:r>
           </w:p>
         </w:tc>
@@ -5769,7 +5647,7 @@
           <w:i w:val="0"/>
           <w:sz w:val="21"/>
         </w:rPr>
-        <w:t>9 輪皆無拒絕、無再排程失敗；6 個零星任務全部於硬截止前完成、10 個非週期任務全部於軟截止前完成。逐格驗證 C23 平衡 0 違反、SOC 維持在 [soc_min, soc_max] 0 違反、放寬儲能/機組/再生能源限制每輪皆成立。</w:t>
+        <w:t>9 輪皆無拒絕、無再排程失敗；38 個週期 job、6 個零星任務全部於硬截止前完成、10 個非週期任務全部於軟截止前完成。逐格驗證 C23 平衡 0 違反、SOC 維持在 [soc_min, soc_max] 0 違反、放寬儲能/機組/再生能源限制每輪皆成立。</w:t>
       </w:r>
     </w:p>
     <w:p>
@@ -5897,7 +5775,7 @@
                 <w:rFonts w:ascii="Microsoft JhengHei" w:hAnsi="Microsoft JhengHei" w:eastAsia="Microsoft JhengHei"/>
                 <w:sz w:val="18"/>
               </w:rPr>
-              <w:t>−72475.6</w:t>
+              <w:t>−69410.4</w:t>
             </w:r>
           </w:p>
         </w:tc>
@@ -5912,7 +5790,7 @@
                 <w:rFonts w:ascii="Microsoft JhengHei" w:hAnsi="Microsoft JhengHei" w:eastAsia="Microsoft JhengHei"/>
                 <w:sz w:val="18"/>
               </w:rPr>
-              <w:t>−88505.4</w:t>
+              <w:t>−83238.8</w:t>
             </w:r>
           </w:p>
         </w:tc>
@@ -5927,7 +5805,7 @@
                 <w:rFonts w:ascii="Microsoft JhengHei" w:hAnsi="Microsoft JhengHei" w:eastAsia="Microsoft JhengHei"/>
                 <w:sz w:val="18"/>
               </w:rPr>
-              <w:t>−16029.8（更佳）</w:t>
+              <w:t>−13828.4（更佳）</w:t>
             </w:r>
           </w:p>
         </w:tc>
@@ -5959,7 +5837,7 @@
                 <w:rFonts w:ascii="Microsoft JhengHei" w:hAnsi="Microsoft JhengHei" w:eastAsia="Microsoft JhengHei"/>
                 <w:sz w:val="18"/>
               </w:rPr>
-              <w:t>296580</w:t>
+              <w:t>296403.6</w:t>
             </w:r>
           </w:p>
         </w:tc>
@@ -5974,7 +5852,7 @@
                 <w:rFonts w:ascii="Microsoft JhengHei" w:hAnsi="Microsoft JhengHei" w:eastAsia="Microsoft JhengHei"/>
                 <w:sz w:val="18"/>
               </w:rPr>
-              <w:t>305700</w:t>
+              <w:t>311428.9</w:t>
             </w:r>
           </w:p>
         </w:tc>
@@ -5989,7 +5867,7 @@
                 <w:rFonts w:ascii="Microsoft JhengHei" w:hAnsi="Microsoft JhengHei" w:eastAsia="Microsoft JhengHei"/>
                 <w:sz w:val="18"/>
               </w:rPr>
-              <w:t>+9120</w:t>
+              <w:t>+15025.3</w:t>
             </w:r>
           </w:p>
         </w:tc>
@@ -6021,7 +5899,7 @@
                 <w:rFonts w:ascii="Microsoft JhengHei" w:hAnsi="Microsoft JhengHei" w:eastAsia="Microsoft JhengHei"/>
                 <w:sz w:val="18"/>
               </w:rPr>
-              <w:t>389055.6</w:t>
+              <w:t>385814.0</w:t>
             </w:r>
           </w:p>
         </w:tc>
@@ -6036,7 +5914,7 @@
                 <w:rFonts w:ascii="Microsoft JhengHei" w:hAnsi="Microsoft JhengHei" w:eastAsia="Microsoft JhengHei"/>
                 <w:sz w:val="18"/>
               </w:rPr>
-              <w:t>394205.4</w:t>
+              <w:t>394667.8</w:t>
             </w:r>
           </w:p>
         </w:tc>
@@ -6051,7 +5929,7 @@
                 <w:rFonts w:ascii="Microsoft JhengHei" w:hAnsi="Microsoft JhengHei" w:eastAsia="Microsoft JhengHei"/>
                 <w:sz w:val="18"/>
               </w:rPr>
-              <w:t>+5149.8</w:t>
+              <w:t>+8853.8</w:t>
             </w:r>
           </w:p>
         </w:tc>
@@ -6207,7 +6085,7 @@
                 <w:rFonts w:ascii="Microsoft JhengHei" w:hAnsi="Microsoft JhengHei" w:eastAsia="Microsoft JhengHei"/>
                 <w:sz w:val="18"/>
               </w:rPr>
-              <w:t>0.16</w:t>
+              <w:t>0.15</w:t>
             </w:r>
           </w:p>
         </w:tc>
@@ -6237,7 +6115,7 @@
                 <w:rFonts w:ascii="Microsoft JhengHei" w:hAnsi="Microsoft JhengHei" w:eastAsia="Microsoft JhengHei"/>
                 <w:sz w:val="18"/>
               </w:rPr>
-              <w:t>−0.16</w:t>
+              <w:t>−0.15</w:t>
             </w:r>
           </w:p>
         </w:tc>
@@ -6331,7 +6209,7 @@
                 <w:rFonts w:ascii="Microsoft JhengHei" w:hAnsi="Microsoft JhengHei" w:eastAsia="Microsoft JhengHei"/>
                 <w:sz w:val="18"/>
               </w:rPr>
-              <w:t>4.9</w:t>
+              <w:t>3.63</w:t>
             </w:r>
           </w:p>
         </w:tc>
@@ -6346,7 +6224,7 @@
                 <w:rFonts w:ascii="Microsoft JhengHei" w:hAnsi="Microsoft JhengHei" w:eastAsia="Microsoft JhengHei"/>
                 <w:sz w:val="18"/>
               </w:rPr>
-              <w:t>4.36</w:t>
+              <w:t>2.65</w:t>
             </w:r>
           </w:p>
         </w:tc>
@@ -6361,7 +6239,7 @@
                 <w:rFonts w:ascii="Microsoft JhengHei" w:hAnsi="Microsoft JhengHei" w:eastAsia="Microsoft JhengHei"/>
                 <w:sz w:val="18"/>
               </w:rPr>
-              <w:t>−0.54</w:t>
+              <w:t>−0.98</w:t>
             </w:r>
           </w:p>
         </w:tc>
@@ -6450,7 +6328,7 @@
           <w:rFonts w:ascii="Microsoft JhengHei" w:hAnsi="Microsoft JhengHei" w:eastAsia="Microsoft JhengHei"/>
           <w:sz w:val="21"/>
         </w:rPr>
-        <w:t>靜態日前計畫雖一次看到所有任務，但只承諾一份排程，漏掉 2 個非週期任務（a2、a5，軟逾時率 0.2）。動態法隨任務到達再最佳化並為其保留容量，10 個全部準時完成（軟逾時率 0.0），平均回應時間由 4.9 降到 4.36。</w:t>
+        <w:t>靜態日前計畫雖一次看到所有任務，但只承諾一份排程，漏掉 2 個非週期任務（a2、a5，軟逾時率 0.2）。動態法隨任務到達再最佳化並為其保留容量，10 個全部準時完成（軟逾時率 0.0），平均回應時間由 3.63 降到 2.65。</w:t>
       </w:r>
     </w:p>
     <w:p>
@@ -6463,7 +6341,7 @@
           <w:rFonts w:ascii="Microsoft JhengHei" w:hAnsi="Microsoft JhengHei" w:eastAsia="Microsoft JhengHei"/>
           <w:sz w:val="21"/>
         </w:rPr>
-        <w:t>消除 2 個軟逾時 = 省下 2 × α = 20000 罰則，主導了 objective 的改善（−72476 → −88505）。</w:t>
+        <w:t>消除 2 個軟逾時 = 省下 2 × α = 20000 罰則，主導了 objective 的改善（−69410 → −83239）。</w:t>
       </w:r>
     </w:p>
     <w:p>
@@ -6476,7 +6354,7 @@
           <w:rFonts w:ascii="Microsoft JhengHei" w:hAnsi="Microsoft JhengHei" w:eastAsia="Microsoft JhengHei"/>
           <w:sz w:val="21"/>
         </w:rPr>
-        <w:t>代價清晰可見：保留容量並補償實際再生能源短缺使機組成本上升（+9120）；較大的承諾發電同時讓售電收益略增（+5150）。扣掉逾時罰則後，動態法在總目標上明顯更佳，印證 9.2 的權衡分析。</w:t>
+        <w:t>代價清晰可見：保留容量並補償實際再生能源短缺使機組成本上升（+15025）；較大的承諾發電同時讓售電收益增加（+8854）。扣掉逾時罰則後，動態法在總目標上明顯更佳，印證 9.2 的權衡分析。</w:t>
       </w:r>
     </w:p>
     <w:p>
@@ -7252,7 +7130,7 @@
           <w:b w:val="0"/>
           <w:sz w:val="21"/>
         </w:rPr>
-        <w:t>週期任務是用『生成—驗證』迴圈隨機產生的，會反覆重抽直到同時滿足作業所有限制。我們刻意先生成 d=e 的任務和非搶占任務來保證最難滿足的條件。這次產生 9 個週期任務，frame size 是 4，展開後是 34 個 job，超過 30 個；密度 1.22 遠高於 0.7 的下限；frame size 也通過 2f − gcd(f,p) ≤ d 這條。</w:t>
+        <w:t>週期任務是用『生成—驗證』迴圈隨機產生的，會反覆重抽直到同時滿足作業所有限制。我們刻意先生成 d=e 的任務和非搶占任務來保證最難滿足的條件；並加了固定種子讓任務集可重現。這次產生 8 個週期任務，frame size 是 4，展開後是 38 個 job，超過 30 個；密度 1.31 遠高於 0.7 的下限；frame size 也通過 2f − gcd(f,p) ≤ d 這條。</w:t>
       </w:r>
     </w:p>
     <w:p>
@@ -7265,7 +7143,7 @@
           <w:rFonts w:ascii="Microsoft JhengHei" w:hAnsi="Microsoft JhengHei" w:eastAsia="Microsoft JhengHei"/>
           <w:sz w:val="21"/>
         </w:rPr>
-        <w:t>報出關鍵數字：9 個任務、frame=4、34 個 job、密度 1.22。</w:t>
+        <w:t>報出關鍵數字：8 個任務、frame=4、38 個 job、密度 1.31。</w:t>
       </w:r>
     </w:p>
     <w:p>
@@ -7684,7 +7562,7 @@
           <w:b w:val="0"/>
           <w:sz w:val="21"/>
         </w:rPr>
-        <w:t>這次動態排程跑了 9 輪、9 次 MILP，大約 15 秒。任務隨時間陸續到達並被接受：例如第 2 小時揭露 s1、a1、a2，第 28 小時揭露 s3、a5，一路到第 66 小時的 s6、a10。最後所有 34 個週期 job、6 個零星 job 都在硬截止前完成，10 個非週期 job 也都在軟截止前完成；硬逾時率 0、軟逾時率 0。每一格的供需平衡和 SOC 範圍我們也都逐格驗證沒有違反。</w:t>
+        <w:t>這次動態排程跑了 9 輪、9 次 MILP，大約 12 秒（單執行緒、可重現）。任務隨時間陸續到達並被接受：例如第 2 小時揭露 s1、a1、a2，第 28 小時揭露 s3、a5，一路到第 66 小時的 s6、a10。最後所有 38 個週期 job、6 個零星 job 都在硬截止前完成，10 個非週期 job 也都在軟截止前完成；硬逾時率 0、軟逾時率 0。每一格的供需平衡和 SOC 範圍我們也都逐格驗證沒有違反。</w:t>
       </w:r>
     </w:p>
     <w:p>
@@ -7697,7 +7575,7 @@
           <w:rFonts w:ascii="Microsoft JhengHei" w:hAnsi="Microsoft JhengHei" w:eastAsia="Microsoft JhengHei"/>
           <w:sz w:val="21"/>
         </w:rPr>
-        <w:t>報出：9 輪、9 次解、約 15 秒、全部準時。</w:t>
+        <w:t>報出：9 輪、9 次解、約 12 秒、全部準時。</w:t>
       </w:r>
     </w:p>
     <w:p>
@@ -7756,7 +7634,7 @@
           <w:b w:val="0"/>
           <w:sz w:val="21"/>
         </w:rPr>
-        <w:t>最關鍵的比較在這裡。靜態法雖然一次看到所有任務，但只承諾一份計畫，結果漏掉 2 個非週期任務，軟逾時率 0.2。動態法隨任務到達再最佳化、並主動保留容量，10 個非週期任務全部準時，軟逾時率變成 0，平均回應時間也從 4.9 降到 4.36。少漏 2 個就省下 2 萬元罰則，這主導了總目標從 −72476 改善到 −88505。代價是：保留容量加上補償太陽能實際短缺，機組成本多了約 9 千；不過較大的發電也讓售電收益增加約 5 千。這正好驗證我們前面說的──提高接收率要用機組成本來換，三個目標沒辦法同時最佳化。</w:t>
+        <w:t>最關鍵的比較在這裡。靜態法雖然一次看到所有任務，但只承諾一份計畫，結果漏掉 2 個非週期任務，軟逾時率 0.2。動態法隨任務到達再最佳化、並主動保留容量，10 個非週期任務全部準時，軟逾時率變成 0，平均回應時間也從 3.63 降到 2.65。少漏 2 個就省下 2 萬元罰則，這主導了總目標從 −69410 改善到 −83239。代價是：保留容量加上補償太陽能實際短缺，機組成本多了約 1.5 萬；不過較大的發電也讓售電收益增加約 8.9 千。這正好驗證我們前面說的──提高接收率要用機組成本來換，三個目標沒辦法同時最佳化。</w:t>
       </w:r>
     </w:p>
     <w:p>
@@ -7896,7 +7774,7 @@
           <w:rFonts w:ascii="Microsoft JhengHei" w:hAnsi="Microsoft JhengHei" w:eastAsia="Microsoft JhengHei"/>
           <w:sz w:val="21"/>
         </w:rPr>
-        <w:t>Q：動態法的計算成本？　A：本例 9 次解約 15 秒；釘住前綴讓 presolve 消去已承諾段，再解規模隨時間縮小。</w:t>
+        <w:t>Q：動態法的計算成本？　A：本例 9 次解約 12 秒（單執行緒）；釘住前綴讓 presolve 消去已承諾段，再解規模隨時間縮小。</w:t>
       </w:r>
     </w:p>
     <w:p>
@@ -7922,7 +7800,7 @@
           <w:rFonts w:ascii="Microsoft JhengHei" w:hAnsi="Microsoft JhengHei" w:eastAsia="Microsoft JhengHei"/>
           <w:sz w:val="21"/>
         </w:rPr>
-        <w:t>Q：completion_time_jitter 動態略增（40→42.3）為何仍較好？　A：jitter 是同任務各 instance 完成時刻的離散度，動態法為保留容量微調了部分週期 job 的完成時刻，但硬截止全數守住、且總目標更佳，屬可接受的取捨。</w:t>
+        <w:t>Q：completion_time_jitter 動態略增（44.1→45.8）為何仍較好？　A：jitter 是同任務各 instance 完成時刻的離散度，動態法為保留容量微調了部分週期 job 的完成時刻，但硬截止全數守住、且總目標更佳，屬可接受的取捨。</w:t>
       </w:r>
     </w:p>
     <w:p>

</xml_diff>